<commit_message>
Classes 10 and 11 updated.
</commit_message>
<xml_diff>
--- a/class10w.docx
+++ b/class10w.docx
@@ -178,8 +178,110 @@
       </w:pPr>
       <w:r>
         <w:rPr>
+          <w:rStyle w:val="NormalTok"/>
+        </w:rPr>
+        <w:t xml:space="preserve">knitr</w:t>
+      </w:r>
+      <w:r>
+        <w:rPr>
+          <w:rStyle w:val="SpecialCharTok"/>
+        </w:rPr>
+        <w:t xml:space="preserve">::</w:t>
+      </w:r>
+      <w:r>
+        <w:rPr>
+          <w:rStyle w:val="NormalTok"/>
+        </w:rPr>
+        <w:t xml:space="preserve">opts_chunk</w:t>
+      </w:r>
+      <w:r>
+        <w:rPr>
+          <w:rStyle w:val="SpecialCharTok"/>
+        </w:rPr>
+        <w:t xml:space="preserve">$</w:t>
+      </w:r>
+      <w:r>
+        <w:rPr>
           <w:rStyle w:val="FunctionTok"/>
         </w:rPr>
+        <w:t xml:space="preserve">set</w:t>
+      </w:r>
+      <w:r>
+        <w:rPr>
+          <w:rStyle w:val="NormalTok"/>
+        </w:rPr>
+        <w:t xml:space="preserve">(</w:t>
+      </w:r>
+      <w:r>
+        <w:rPr>
+          <w:rStyle w:val="AttributeTok"/>
+        </w:rPr>
+        <w:t xml:space="preserve">comment =</w:t>
+      </w:r>
+      <w:r>
+        <w:rPr>
+          <w:rStyle w:val="NormalTok"/>
+        </w:rPr>
+        <w:t xml:space="preserve"> </w:t>
+      </w:r>
+      <w:r>
+        <w:rPr>
+          <w:rStyle w:val="ConstantTok"/>
+        </w:rPr>
+        <w:t xml:space="preserve">NA</w:t>
+      </w:r>
+      <w:r>
+        <w:rPr>
+          <w:rStyle w:val="NormalTok"/>
+        </w:rPr>
+        <w:t xml:space="preserve">)</w:t>
+      </w:r>
+      <w:r>
+        <w:br/>
+      </w:r>
+      <w:r>
+        <w:br/>
+      </w:r>
+      <w:r>
+        <w:rPr>
+          <w:rStyle w:val="FunctionTok"/>
+        </w:rPr>
+        <w:t xml:space="preserve">source</w:t>
+      </w:r>
+      <w:r>
+        <w:rPr>
+          <w:rStyle w:val="NormalTok"/>
+        </w:rPr>
+        <w:t xml:space="preserve">(</w:t>
+      </w:r>
+      <w:r>
+        <w:rPr>
+          <w:rStyle w:val="StringTok"/>
+        </w:rPr>
+        <w:t xml:space="preserve">"c10/data/Love-431.R"</w:t>
+      </w:r>
+      <w:r>
+        <w:rPr>
+          <w:rStyle w:val="NormalTok"/>
+        </w:rPr>
+        <w:t xml:space="preserve">) </w:t>
+      </w:r>
+      <w:r>
+        <w:rPr>
+          <w:rStyle w:val="CommentTok"/>
+        </w:rPr>
+        <w:t xml:space="preserve"># for the lovedist() function</w:t>
+      </w:r>
+      <w:r>
+        <w:br/>
+      </w:r>
+      <w:r>
+        <w:br/>
+      </w:r>
+      <w:r>
+        <w:rPr>
+          <w:rStyle w:val="FunctionTok"/>
+        </w:rPr>
         <w:t xml:space="preserve">library</w:t>
       </w:r>
       <w:r>
@@ -325,105 +427,6 @@
           <w:rStyle w:val="DocumentationTok"/>
         </w:rPr>
         <w:t xml:space="preserve">## new theme for ggplots!</w:t>
-      </w:r>
-      <w:r>
-        <w:br/>
-      </w:r>
-      <w:r>
-        <w:rPr>
-          <w:rStyle w:val="NormalTok"/>
-        </w:rPr>
-        <w:t xml:space="preserve">knitr</w:t>
-      </w:r>
-      <w:r>
-        <w:rPr>
-          <w:rStyle w:val="SpecialCharTok"/>
-        </w:rPr>
-        <w:t xml:space="preserve">::</w:t>
-      </w:r>
-      <w:r>
-        <w:rPr>
-          <w:rStyle w:val="NormalTok"/>
-        </w:rPr>
-        <w:t xml:space="preserve">opts_chunk</w:t>
-      </w:r>
-      <w:r>
-        <w:rPr>
-          <w:rStyle w:val="SpecialCharTok"/>
-        </w:rPr>
-        <w:t xml:space="preserve">$</w:t>
-      </w:r>
-      <w:r>
-        <w:rPr>
-          <w:rStyle w:val="FunctionTok"/>
-        </w:rPr>
-        <w:t xml:space="preserve">set</w:t>
-      </w:r>
-      <w:r>
-        <w:rPr>
-          <w:rStyle w:val="NormalTok"/>
-        </w:rPr>
-        <w:t xml:space="preserve">(</w:t>
-      </w:r>
-      <w:r>
-        <w:rPr>
-          <w:rStyle w:val="AttributeTok"/>
-        </w:rPr>
-        <w:t xml:space="preserve">comment =</w:t>
-      </w:r>
-      <w:r>
-        <w:rPr>
-          <w:rStyle w:val="NormalTok"/>
-        </w:rPr>
-        <w:t xml:space="preserve"> </w:t>
-      </w:r>
-      <w:r>
-        <w:rPr>
-          <w:rStyle w:val="ConstantTok"/>
-        </w:rPr>
-        <w:t xml:space="preserve">NA</w:t>
-      </w:r>
-      <w:r>
-        <w:rPr>
-          <w:rStyle w:val="NormalTok"/>
-        </w:rPr>
-        <w:t xml:space="preserve">)</w:t>
-      </w:r>
-      <w:r>
-        <w:br/>
-      </w:r>
-      <w:r>
-        <w:br/>
-      </w:r>
-      <w:r>
-        <w:rPr>
-          <w:rStyle w:val="FunctionTok"/>
-        </w:rPr>
-        <w:t xml:space="preserve">source</w:t>
-      </w:r>
-      <w:r>
-        <w:rPr>
-          <w:rStyle w:val="NormalTok"/>
-        </w:rPr>
-        <w:t xml:space="preserve">(</w:t>
-      </w:r>
-      <w:r>
-        <w:rPr>
-          <w:rStyle w:val="StringTok"/>
-        </w:rPr>
-        <w:t xml:space="preserve">"c10/data/Love-431.R"</w:t>
-      </w:r>
-      <w:r>
-        <w:rPr>
-          <w:rStyle w:val="NormalTok"/>
-        </w:rPr>
-        <w:t xml:space="preserve">) </w:t>
-      </w:r>
-      <w:r>
-        <w:rPr>
-          <w:rStyle w:val="CommentTok"/>
-        </w:rPr>
-        <w:t xml:space="preserve"># for the lovedist() function</w:t>
       </w:r>
     </w:p>
     <w:bookmarkEnd w:id="10"/>

</xml_diff>